<commit_message>
apro config valtozasok a pkt-ban
</commit_message>
<xml_diff>
--- a/vizsgaremek_bemutatkozás_ig.docx
+++ b/vizsgaremek_bemutatkozás_ig.docx
@@ -702,14 +702,6 @@
         </w:rPr>
         <w:t>Köszönöm megtisztelő figyelmüket!</w:t>
       </w:r>
-    </w:p>
-    <w:p>
-      <w:pPr>
-        <w:jc w:val="both"/>
-        <w:rPr>
-          <w:rFonts w:ascii="Times New Roman" w:hAnsi="Times New Roman" w:cs="Times New Roman"/>
-        </w:rPr>
-      </w:pPr>
     </w:p>
     <w:p>
       <w:pPr>
@@ -1042,22 +1034,28 @@
         <w:rPr>
           <w:rFonts w:ascii="Times New Roman" w:hAnsi="Times New Roman" w:cs="Times New Roman"/>
         </w:rPr>
+        <w:t xml:space="preserve">Itt a dolgozóknak és vezetőségnek/titkárságnak van fenntartva két külön irodai helység, amik között már arányaiban jelentős távolság van, ezért két Routert helyeztünk el és számos </w:t>
+      </w:r>
+      <w:proofErr w:type="spellStart"/>
+      <w:r>
+        <w:rPr>
+          <w:rFonts w:ascii="Times New Roman" w:hAnsi="Times New Roman" w:cs="Times New Roman"/>
+        </w:rPr>
+        <w:t>Switchet</w:t>
+      </w:r>
+      <w:proofErr w:type="spellEnd"/>
+      <w:r>
+        <w:rPr>
+          <w:rFonts w:ascii="Times New Roman" w:hAnsi="Times New Roman" w:cs="Times New Roman"/>
+        </w:rPr>
+        <w:t xml:space="preserve"> </w:t>
+      </w:r>
+      <w:r>
+        <w:rPr>
+          <w:rFonts w:ascii="Times New Roman" w:hAnsi="Times New Roman" w:cs="Times New Roman"/>
+        </w:rPr>
         <w:lastRenderedPageBreak/>
-        <w:t xml:space="preserve">Itt a dolgozóknak és vezetőségnek/titkárságnak van fenntartva két külön irodai helység, amik között már arányaiban jelentős távolság van, ezért két Routert helyeztünk el és számos </w:t>
-      </w:r>
-      <w:proofErr w:type="spellStart"/>
-      <w:r>
-        <w:rPr>
-          <w:rFonts w:ascii="Times New Roman" w:hAnsi="Times New Roman" w:cs="Times New Roman"/>
-        </w:rPr>
-        <w:t>Switchet</w:t>
-      </w:r>
-      <w:proofErr w:type="spellEnd"/>
-      <w:r>
-        <w:rPr>
-          <w:rFonts w:ascii="Times New Roman" w:hAnsi="Times New Roman" w:cs="Times New Roman"/>
-        </w:rPr>
-        <w:t xml:space="preserve"> ezzel biztosítva az adatforgalom elosztását, sávszéleség biztosítását. Ugyanazon eszközök között UTP </w:t>
+        <w:t xml:space="preserve">ezzel biztosítva az adatforgalom elosztását, sávszéleség biztosítását. Ugyanazon eszközök között UTP </w:t>
       </w:r>
       <w:proofErr w:type="spellStart"/>
       <w:r>
@@ -1668,6 +1666,17 @@
         </w:rPr>
         <w:t xml:space="preserve"> </w:t>
       </w:r>
+    </w:p>
+    <w:p>
+      <w:pPr>
+        <w:jc w:val="both"/>
+        <w:rPr>
+          <w:rFonts w:ascii="Times New Roman" w:hAnsi="Times New Roman" w:cs="Times New Roman"/>
+          <w:color w:val="A02B93" w:themeColor="accent5"/>
+          <w:sz w:val="28"/>
+          <w:szCs w:val="28"/>
+        </w:rPr>
+      </w:pPr>
     </w:p>
     <w:p>
       <w:pPr>

</xml_diff>

<commit_message>
dual stack management védelmi acl-t ledokumentáltam
</commit_message>
<xml_diff>
--- a/vizsgaremek_bemutatkozás_ig.docx
+++ b/vizsgaremek_bemutatkozás_ig.docx
@@ -983,7 +983,7 @@
                     <pic:cNvPicPr/>
                   </pic:nvPicPr>
                   <pic:blipFill rotWithShape="1">
-                    <a:blip r:embed="rId7"/>
+                    <a:blip r:embed="rId8"/>
                     <a:srcRect l="18380" t="8803" r="12395" b="14813"/>
                     <a:stretch>
                       <a:fillRect/>
@@ -1568,7 +1568,7 @@
                     <pic:cNvPicPr/>
                   </pic:nvPicPr>
                   <pic:blipFill>
-                    <a:blip r:embed="rId8"/>
+                    <a:blip r:embed="rId9"/>
                     <a:stretch>
                       <a:fillRect/>
                     </a:stretch>
@@ -2187,7 +2187,7 @@
                     <pic:cNvPicPr/>
                   </pic:nvPicPr>
                   <pic:blipFill>
-                    <a:blip r:embed="rId9"/>
+                    <a:blip r:embed="rId10"/>
                     <a:stretch>
                       <a:fillRect/>
                     </a:stretch>
@@ -2642,7 +2642,7 @@
                     <pic:cNvPicPr/>
                   </pic:nvPicPr>
                   <pic:blipFill>
-                    <a:blip r:embed="rId10"/>
+                    <a:blip r:embed="rId11"/>
                     <a:stretch>
                       <a:fillRect/>
                     </a:stretch>
@@ -2806,7 +2806,7 @@
                     <pic:cNvPicPr/>
                   </pic:nvPicPr>
                   <pic:blipFill>
-                    <a:blip r:embed="rId11"/>
+                    <a:blip r:embed="rId12"/>
                     <a:stretch>
                       <a:fillRect/>
                     </a:stretch>
@@ -3060,7 +3060,7 @@
                     <pic:cNvPicPr/>
                   </pic:nvPicPr>
                   <pic:blipFill>
-                    <a:blip r:embed="rId12"/>
+                    <a:blip r:embed="rId13"/>
                     <a:stretch>
                       <a:fillRect/>
                     </a:stretch>
@@ -3766,7 +3766,7 @@
                     <pic:cNvPicPr/>
                   </pic:nvPicPr>
                   <pic:blipFill rotWithShape="1">
-                    <a:blip r:embed="rId13"/>
+                    <a:blip r:embed="rId14"/>
                     <a:srcRect r="174" b="69571"/>
                     <a:stretch>
                       <a:fillRect/>
@@ -4268,7 +4268,7 @@
                     <pic:cNvPicPr/>
                   </pic:nvPicPr>
                   <pic:blipFill>
-                    <a:blip r:embed="rId14"/>
+                    <a:blip r:embed="rId15"/>
                     <a:stretch>
                       <a:fillRect/>
                     </a:stretch>
@@ -5125,7 +5125,7 @@
                     <pic:cNvPicPr/>
                   </pic:nvPicPr>
                   <pic:blipFill>
-                    <a:blip r:embed="rId15"/>
+                    <a:blip r:embed="rId16"/>
                     <a:stretch>
                       <a:fillRect/>
                     </a:stretch>
@@ -5405,7 +5405,7 @@
                     <pic:cNvPicPr/>
                   </pic:nvPicPr>
                   <pic:blipFill>
-                    <a:blip r:embed="rId16"/>
+                    <a:blip r:embed="rId17"/>
                     <a:stretch>
                       <a:fillRect/>
                     </a:stretch>
@@ -5792,7 +5792,7 @@
                     <pic:cNvPicPr/>
                   </pic:nvPicPr>
                   <pic:blipFill>
-                    <a:blip r:embed="rId17"/>
+                    <a:blip r:embed="rId18"/>
                     <a:stretch>
                       <a:fillRect/>
                     </a:stretch>
@@ -5834,7 +5834,7 @@
                     <pic:cNvPicPr/>
                   </pic:nvPicPr>
                   <pic:blipFill>
-                    <a:blip r:embed="rId18"/>
+                    <a:blip r:embed="rId19"/>
                     <a:stretch>
                       <a:fillRect/>
                     </a:stretch>
@@ -6342,7 +6342,7 @@
                     <pic:cNvPicPr/>
                   </pic:nvPicPr>
                   <pic:blipFill>
-                    <a:blip r:embed="rId19"/>
+                    <a:blip r:embed="rId20"/>
                     <a:stretch>
                       <a:fillRect/>
                     </a:stretch>
@@ -7417,7 +7417,7 @@
                     <pic:cNvPicPr/>
                   </pic:nvPicPr>
                   <pic:blipFill>
-                    <a:blip r:embed="rId20"/>
+                    <a:blip r:embed="rId21"/>
                     <a:stretch>
                       <a:fillRect/>
                     </a:stretch>
@@ -7477,7 +7477,7 @@
                     <pic:cNvPicPr/>
                   </pic:nvPicPr>
                   <pic:blipFill>
-                    <a:blip r:embed="rId21"/>
+                    <a:blip r:embed="rId22"/>
                     <a:stretch>
                       <a:fillRect/>
                     </a:stretch>
@@ -8863,7 +8863,7 @@
                     <pic:cNvPicPr/>
                   </pic:nvPicPr>
                   <pic:blipFill>
-                    <a:blip r:embed="rId22"/>
+                    <a:blip r:embed="rId23"/>
                     <a:stretch>
                       <a:fillRect/>
                     </a:stretch>
@@ -9972,7 +9972,7 @@
                     <pic:cNvPicPr/>
                   </pic:nvPicPr>
                   <pic:blipFill>
-                    <a:blip r:embed="rId23"/>
+                    <a:blip r:embed="rId24"/>
                     <a:stretch>
                       <a:fillRect/>
                     </a:stretch>
@@ -10593,7 +10593,7 @@
                     <pic:cNvPicPr/>
                   </pic:nvPicPr>
                   <pic:blipFill>
-                    <a:blip r:embed="rId24"/>
+                    <a:blip r:embed="rId25"/>
                     <a:stretch>
                       <a:fillRect/>
                     </a:stretch>
@@ -11140,7 +11140,7 @@
                     <pic:cNvPicPr/>
                   </pic:nvPicPr>
                   <pic:blipFill>
-                    <a:blip r:embed="rId25"/>
+                    <a:blip r:embed="rId26"/>
                     <a:stretch>
                       <a:fillRect/>
                     </a:stretch>
@@ -11372,7 +11372,7 @@
                     <pic:cNvPicPr/>
                   </pic:nvPicPr>
                   <pic:blipFill>
-                    <a:blip r:embed="rId26"/>
+                    <a:blip r:embed="rId27"/>
                     <a:stretch>
                       <a:fillRect/>
                     </a:stretch>
@@ -11477,7 +11477,7 @@
                     <pic:cNvPicPr/>
                   </pic:nvPicPr>
                   <pic:blipFill>
-                    <a:blip r:embed="rId27"/>
+                    <a:blip r:embed="rId28"/>
                     <a:stretch>
                       <a:fillRect/>
                     </a:stretch>
@@ -11515,6 +11515,465 @@
           <w:rFonts w:ascii="Times New Roman" w:hAnsi="Times New Roman" w:cs="Times New Roman"/>
         </w:rPr>
       </w:pPr>
+      <w:proofErr w:type="spellStart"/>
+      <w:r>
+        <w:rPr>
+          <w:rFonts w:ascii="Times New Roman" w:hAnsi="Times New Roman" w:cs="Times New Roman"/>
+          <w:highlight w:val="yellow"/>
+        </w:rPr>
+        <w:t>Dual-stack</w:t>
+      </w:r>
+      <w:proofErr w:type="spellEnd"/>
+      <w:r>
+        <w:rPr>
+          <w:rFonts w:ascii="Times New Roman" w:hAnsi="Times New Roman" w:cs="Times New Roman"/>
+          <w:highlight w:val="yellow"/>
+        </w:rPr>
+        <w:t xml:space="preserve"> Management védelmi ACL-</w:t>
+      </w:r>
+    </w:p>
+    <w:p>
+      <w:pPr>
+        <w:spacing w:after="0" w:line="240" w:lineRule="auto"/>
+        <w:jc w:val="both"/>
+        <w:rPr>
+          <w:rFonts w:ascii="Times New Roman" w:hAnsi="Times New Roman" w:cs="Times New Roman"/>
+        </w:rPr>
+      </w:pPr>
+    </w:p>
+    <w:p>
+      <w:pPr>
+        <w:spacing w:after="0" w:line="240" w:lineRule="auto"/>
+        <w:rPr>
+          <w:rFonts w:ascii="Times New Roman" w:hAnsi="Times New Roman" w:cs="Times New Roman"/>
+        </w:rPr>
+      </w:pPr>
+      <w:r>
+        <w:rPr>
+          <w:rFonts w:ascii="Times New Roman" w:hAnsi="Times New Roman" w:cs="Times New Roman"/>
+        </w:rPr>
+        <w:t>A Szegedi Titkárság hálózatában a felhasználói gépek alapértelmezett átjárója a</w:t>
+      </w:r>
+      <w:r>
+        <w:rPr>
+          <w:rFonts w:ascii="Times New Roman" w:hAnsi="Times New Roman" w:cs="Times New Roman"/>
+        </w:rPr>
+        <w:t xml:space="preserve"> SZEG_TR Gig0/1</w:t>
+      </w:r>
+      <w:r>
+        <w:rPr>
+          <w:rFonts w:ascii="Times New Roman" w:hAnsi="Times New Roman" w:cs="Times New Roman"/>
+        </w:rPr>
+        <w:t>interfésze.</w:t>
+      </w:r>
+      <w:r>
+        <w:rPr>
+          <w:rFonts w:ascii="Times New Roman" w:hAnsi="Times New Roman" w:cs="Times New Roman"/>
+        </w:rPr>
+        <w:br/>
+        <w:t xml:space="preserve">A biztonság növelése érdekében szükséges megakadályozni, hogy a titkársági kliensek </w:t>
+      </w:r>
+      <w:r>
+        <w:rPr>
+          <w:rFonts w:ascii="Times New Roman" w:hAnsi="Times New Roman" w:cs="Times New Roman"/>
+        </w:rPr>
+        <w:lastRenderedPageBreak/>
+        <w:t>közvetlenül elérjék a router menedzsment IP</w:t>
+      </w:r>
+      <w:r>
+        <w:rPr>
+          <w:rFonts w:ascii="Times New Roman" w:hAnsi="Times New Roman" w:cs="Times New Roman"/>
+        </w:rPr>
+        <w:noBreakHyphen/>
+        <w:t xml:space="preserve">címeit (SSH, </w:t>
+      </w:r>
+      <w:proofErr w:type="spellStart"/>
+      <w:r>
+        <w:rPr>
+          <w:rFonts w:ascii="Times New Roman" w:hAnsi="Times New Roman" w:cs="Times New Roman"/>
+        </w:rPr>
+        <w:t>ping</w:t>
+      </w:r>
+      <w:proofErr w:type="spellEnd"/>
+      <w:r>
+        <w:rPr>
+          <w:rFonts w:ascii="Times New Roman" w:hAnsi="Times New Roman" w:cs="Times New Roman"/>
+        </w:rPr>
+        <w:t>, HTTP stb.).</w:t>
+      </w:r>
+      <w:r>
+        <w:rPr>
+          <w:rFonts w:ascii="Times New Roman" w:hAnsi="Times New Roman" w:cs="Times New Roman"/>
+        </w:rPr>
+        <w:br/>
+        <w:t>A forgalom továbbítása (</w:t>
+      </w:r>
+      <w:proofErr w:type="spellStart"/>
+      <w:r>
+        <w:rPr>
+          <w:rFonts w:ascii="Times New Roman" w:hAnsi="Times New Roman" w:cs="Times New Roman"/>
+        </w:rPr>
+        <w:t>routing</w:t>
+      </w:r>
+      <w:proofErr w:type="spellEnd"/>
+      <w:r>
+        <w:rPr>
+          <w:rFonts w:ascii="Times New Roman" w:hAnsi="Times New Roman" w:cs="Times New Roman"/>
+        </w:rPr>
+        <w:t>, internetelérés) továbbra is zavartalanul működik.</w:t>
+      </w:r>
+    </w:p>
+    <w:p>
+      <w:pPr>
+        <w:spacing w:after="0" w:line="240" w:lineRule="auto"/>
+        <w:jc w:val="both"/>
+        <w:rPr>
+          <w:rFonts w:ascii="Times New Roman" w:hAnsi="Times New Roman" w:cs="Times New Roman"/>
+        </w:rPr>
+      </w:pPr>
+      <w:r>
+        <w:rPr>
+          <w:rFonts w:ascii="Times New Roman" w:hAnsi="Times New Roman" w:cs="Times New Roman"/>
+        </w:rPr>
+        <w:t xml:space="preserve">A hálózat </w:t>
+      </w:r>
+      <w:proofErr w:type="spellStart"/>
+      <w:r>
+        <w:rPr>
+          <w:rFonts w:ascii="Times New Roman" w:hAnsi="Times New Roman" w:cs="Times New Roman"/>
+          <w:b/>
+          <w:bCs/>
+        </w:rPr>
+        <w:t>dual</w:t>
+      </w:r>
+      <w:r>
+        <w:rPr>
+          <w:rFonts w:ascii="Times New Roman" w:hAnsi="Times New Roman" w:cs="Times New Roman"/>
+          <w:b/>
+          <w:bCs/>
+        </w:rPr>
+        <w:noBreakHyphen/>
+        <w:t>stack</w:t>
+      </w:r>
+      <w:proofErr w:type="spellEnd"/>
+      <w:r>
+        <w:rPr>
+          <w:rFonts w:ascii="Times New Roman" w:hAnsi="Times New Roman" w:cs="Times New Roman"/>
+        </w:rPr>
+        <w:t xml:space="preserve">, ezért a védelem </w:t>
+      </w:r>
+      <w:r>
+        <w:rPr>
+          <w:rFonts w:ascii="Times New Roman" w:hAnsi="Times New Roman" w:cs="Times New Roman"/>
+          <w:b/>
+          <w:bCs/>
+        </w:rPr>
+        <w:t>IPv4 és IPv6</w:t>
+      </w:r>
+      <w:r>
+        <w:rPr>
+          <w:rFonts w:ascii="Times New Roman" w:hAnsi="Times New Roman" w:cs="Times New Roman"/>
+        </w:rPr>
+        <w:t xml:space="preserve"> protokollokra is kiterjed.</w:t>
+      </w:r>
+    </w:p>
+    <w:p>
+      <w:pPr>
+        <w:spacing w:after="0" w:line="240" w:lineRule="auto"/>
+        <w:jc w:val="both"/>
+        <w:rPr>
+          <w:rFonts w:ascii="Times New Roman" w:hAnsi="Times New Roman" w:cs="Times New Roman"/>
+        </w:rPr>
+      </w:pPr>
+    </w:p>
+    <w:p>
+      <w:pPr>
+        <w:spacing w:after="0" w:line="240" w:lineRule="auto"/>
+        <w:jc w:val="both"/>
+        <w:rPr>
+          <w:rFonts w:ascii="Times New Roman" w:hAnsi="Times New Roman" w:cs="Times New Roman"/>
+        </w:rPr>
+      </w:pPr>
+      <w:r>
+        <w:rPr>
+          <w:rFonts w:ascii="Times New Roman" w:hAnsi="Times New Roman" w:cs="Times New Roman"/>
+        </w:rPr>
+        <w:t>Először létrehoztuk a</w:t>
+      </w:r>
+      <w:r>
+        <w:rPr>
+          <w:rFonts w:ascii="Times New Roman" w:hAnsi="Times New Roman" w:cs="Times New Roman"/>
+        </w:rPr>
+        <w:t xml:space="preserve"> </w:t>
+      </w:r>
+      <w:r>
+        <w:rPr>
+          <w:rFonts w:ascii="Times New Roman" w:hAnsi="Times New Roman" w:cs="Times New Roman"/>
+          <w:color w:val="C00000"/>
+        </w:rPr>
+        <w:t>PROTECT_MGMT</w:t>
+      </w:r>
+      <w:r>
+        <w:rPr>
+          <w:rFonts w:ascii="Times New Roman" w:hAnsi="Times New Roman" w:cs="Times New Roman"/>
+        </w:rPr>
+        <w:t xml:space="preserve"> </w:t>
+      </w:r>
+      <w:proofErr w:type="spellStart"/>
+      <w:r>
+        <w:rPr>
+          <w:rFonts w:ascii="Times New Roman" w:hAnsi="Times New Roman" w:cs="Times New Roman"/>
+        </w:rPr>
+        <w:t>access-list-eket</w:t>
+      </w:r>
+      <w:proofErr w:type="spellEnd"/>
+      <w:r>
+        <w:rPr>
+          <w:rFonts w:ascii="Times New Roman" w:hAnsi="Times New Roman" w:cs="Times New Roman"/>
+        </w:rPr>
+        <w:t xml:space="preserve">. A lényeg, hogy a </w:t>
+      </w:r>
+      <w:r>
+        <w:rPr>
+          <w:rFonts w:ascii="Times New Roman" w:hAnsi="Times New Roman" w:cs="Times New Roman"/>
+          <w:u w:val="single"/>
+        </w:rPr>
+        <w:t>192.168.33.0</w:t>
+      </w:r>
+      <w:r>
+        <w:rPr>
+          <w:rFonts w:ascii="Times New Roman" w:hAnsi="Times New Roman" w:cs="Times New Roman"/>
+        </w:rPr>
+        <w:t xml:space="preserve"> és </w:t>
+      </w:r>
+      <w:r>
+        <w:rPr>
+          <w:rFonts w:ascii="Times New Roman" w:hAnsi="Times New Roman" w:cs="Times New Roman"/>
+          <w:u w:val="single"/>
+        </w:rPr>
+        <w:t>2001:DB</w:t>
+      </w:r>
+      <w:proofErr w:type="gramStart"/>
+      <w:r>
+        <w:rPr>
+          <w:rFonts w:ascii="Times New Roman" w:hAnsi="Times New Roman" w:cs="Times New Roman"/>
+          <w:u w:val="single"/>
+        </w:rPr>
+        <w:t>8:66::</w:t>
+      </w:r>
+      <w:proofErr w:type="gramEnd"/>
+      <w:r>
+        <w:rPr>
+          <w:rFonts w:ascii="Times New Roman" w:hAnsi="Times New Roman" w:cs="Times New Roman"/>
+        </w:rPr>
+        <w:t xml:space="preserve"> címeknek tiltjuk az összes internet </w:t>
+      </w:r>
+      <w:proofErr w:type="spellStart"/>
+      <w:r>
+        <w:rPr>
+          <w:rFonts w:ascii="Times New Roman" w:hAnsi="Times New Roman" w:cs="Times New Roman"/>
+        </w:rPr>
+        <w:t>protkoll</w:t>
+      </w:r>
+      <w:proofErr w:type="spellEnd"/>
+      <w:r>
+        <w:rPr>
+          <w:rFonts w:ascii="Times New Roman" w:hAnsi="Times New Roman" w:cs="Times New Roman"/>
+        </w:rPr>
+        <w:t xml:space="preserve"> elérését a router g0/1-es </w:t>
+      </w:r>
+      <w:proofErr w:type="spellStart"/>
+      <w:r>
+        <w:rPr>
+          <w:rFonts w:ascii="Times New Roman" w:hAnsi="Times New Roman" w:cs="Times New Roman"/>
+        </w:rPr>
+        <w:t>interface</w:t>
+      </w:r>
+      <w:proofErr w:type="spellEnd"/>
+      <w:r>
+        <w:rPr>
+          <w:rFonts w:ascii="Times New Roman" w:hAnsi="Times New Roman" w:cs="Times New Roman"/>
+        </w:rPr>
+        <w:t>-ére</w:t>
+      </w:r>
+      <w:r>
+        <w:rPr>
+          <w:rFonts w:ascii="Times New Roman" w:hAnsi="Times New Roman" w:cs="Times New Roman"/>
+        </w:rPr>
+        <w:t>.</w:t>
+      </w:r>
+    </w:p>
+    <w:p>
+      <w:pPr>
+        <w:spacing w:after="0" w:line="240" w:lineRule="auto"/>
+        <w:jc w:val="both"/>
+        <w:rPr>
+          <w:rFonts w:ascii="Times New Roman" w:hAnsi="Times New Roman" w:cs="Times New Roman"/>
+        </w:rPr>
+      </w:pPr>
+    </w:p>
+    <w:p>
+      <w:pPr>
+        <w:spacing w:after="0" w:line="240" w:lineRule="auto"/>
+        <w:jc w:val="both"/>
+        <w:rPr>
+          <w:rFonts w:ascii="Times New Roman" w:hAnsi="Times New Roman" w:cs="Times New Roman"/>
+        </w:rPr>
+      </w:pPr>
+      <w:r>
+        <w:rPr>
+          <w:rFonts w:ascii="Times New Roman" w:hAnsi="Times New Roman" w:cs="Times New Roman"/>
+        </w:rPr>
+        <w:drawing>
+          <wp:inline distT="0" distB="0" distL="0" distR="0" wp14:anchorId="7B2A6428" wp14:editId="24515F66">
+            <wp:extent cx="4344006" cy="1057423"/>
+            <wp:effectExtent l="0" t="0" r="0" b="9525"/>
+            <wp:docPr id="1919925767" name="Kép 1"/>
+            <wp:cNvGraphicFramePr>
+              <a:graphicFrameLocks xmlns:a="http://schemas.openxmlformats.org/drawingml/2006/main" noChangeAspect="1"/>
+            </wp:cNvGraphicFramePr>
+            <a:graphic xmlns:a="http://schemas.openxmlformats.org/drawingml/2006/main">
+              <a:graphicData uri="http://schemas.openxmlformats.org/drawingml/2006/picture">
+                <pic:pic xmlns:pic="http://schemas.openxmlformats.org/drawingml/2006/picture">
+                  <pic:nvPicPr>
+                    <pic:cNvPr id="1919925767" name=""/>
+                    <pic:cNvPicPr/>
+                  </pic:nvPicPr>
+                  <pic:blipFill>
+                    <a:blip r:embed="rId29"/>
+                    <a:stretch>
+                      <a:fillRect/>
+                    </a:stretch>
+                  </pic:blipFill>
+                  <pic:spPr>
+                    <a:xfrm>
+                      <a:off x="0" y="0"/>
+                      <a:ext cx="4344006" cy="1057423"/>
+                    </a:xfrm>
+                    <a:prstGeom prst="rect">
+                      <a:avLst/>
+                    </a:prstGeom>
+                  </pic:spPr>
+                </pic:pic>
+              </a:graphicData>
+            </a:graphic>
+          </wp:inline>
+        </w:drawing>
+      </w:r>
+    </w:p>
+    <w:p>
+      <w:pPr>
+        <w:spacing w:after="0" w:line="240" w:lineRule="auto"/>
+        <w:jc w:val="both"/>
+        <w:rPr>
+          <w:rFonts w:ascii="Times New Roman" w:hAnsi="Times New Roman" w:cs="Times New Roman"/>
+        </w:rPr>
+      </w:pPr>
+    </w:p>
+    <w:p>
+      <w:pPr>
+        <w:spacing w:after="0" w:line="240" w:lineRule="auto"/>
+        <w:jc w:val="both"/>
+        <w:rPr>
+          <w:rFonts w:ascii="Times New Roman" w:hAnsi="Times New Roman" w:cs="Times New Roman"/>
+        </w:rPr>
+      </w:pPr>
+      <w:r>
+        <w:rPr>
+          <w:rFonts w:ascii="Times New Roman" w:hAnsi="Times New Roman" w:cs="Times New Roman"/>
+        </w:rPr>
+        <w:t xml:space="preserve">Majd ezeket ráhelyeztük a kellő </w:t>
+      </w:r>
+      <w:proofErr w:type="spellStart"/>
+      <w:r>
+        <w:rPr>
+          <w:rFonts w:ascii="Times New Roman" w:hAnsi="Times New Roman" w:cs="Times New Roman"/>
+        </w:rPr>
+        <w:t>interface</w:t>
+      </w:r>
+      <w:proofErr w:type="spellEnd"/>
+      <w:r>
+        <w:rPr>
+          <w:rFonts w:ascii="Times New Roman" w:hAnsi="Times New Roman" w:cs="Times New Roman"/>
+        </w:rPr>
+        <w:t>-re, és befelé irányítottuk az ACL-t, mivel azt akarjuk megakadályozni, hogy a routert elérjék a dolgozók a titkárságról.</w:t>
+      </w:r>
+    </w:p>
+    <w:p>
+      <w:pPr>
+        <w:spacing w:after="0" w:line="240" w:lineRule="auto"/>
+        <w:jc w:val="both"/>
+        <w:rPr>
+          <w:rFonts w:ascii="Times New Roman" w:hAnsi="Times New Roman" w:cs="Times New Roman"/>
+        </w:rPr>
+      </w:pPr>
+    </w:p>
+    <w:p>
+      <w:pPr>
+        <w:spacing w:after="0" w:line="240" w:lineRule="auto"/>
+        <w:jc w:val="both"/>
+        <w:rPr>
+          <w:rFonts w:ascii="Times New Roman" w:hAnsi="Times New Roman" w:cs="Times New Roman"/>
+        </w:rPr>
+      </w:pPr>
+      <w:r>
+        <w:rPr>
+          <w:rFonts w:ascii="Times New Roman" w:hAnsi="Times New Roman" w:cs="Times New Roman"/>
+        </w:rPr>
+        <w:drawing>
+          <wp:inline distT="0" distB="0" distL="0" distR="0" wp14:anchorId="0F44654C" wp14:editId="4DEEBE92">
+            <wp:extent cx="3134162" cy="581106"/>
+            <wp:effectExtent l="0" t="0" r="9525" b="9525"/>
+            <wp:docPr id="1678148790" name="Kép 1"/>
+            <wp:cNvGraphicFramePr>
+              <a:graphicFrameLocks xmlns:a="http://schemas.openxmlformats.org/drawingml/2006/main" noChangeAspect="1"/>
+            </wp:cNvGraphicFramePr>
+            <a:graphic xmlns:a="http://schemas.openxmlformats.org/drawingml/2006/main">
+              <a:graphicData uri="http://schemas.openxmlformats.org/drawingml/2006/picture">
+                <pic:pic xmlns:pic="http://schemas.openxmlformats.org/drawingml/2006/picture">
+                  <pic:nvPicPr>
+                    <pic:cNvPr id="1678148790" name=""/>
+                    <pic:cNvPicPr/>
+                  </pic:nvPicPr>
+                  <pic:blipFill>
+                    <a:blip r:embed="rId30"/>
+                    <a:stretch>
+                      <a:fillRect/>
+                    </a:stretch>
+                  </pic:blipFill>
+                  <pic:spPr>
+                    <a:xfrm>
+                      <a:off x="0" y="0"/>
+                      <a:ext cx="3134162" cy="581106"/>
+                    </a:xfrm>
+                    <a:prstGeom prst="rect">
+                      <a:avLst/>
+                    </a:prstGeom>
+                  </pic:spPr>
+                </pic:pic>
+              </a:graphicData>
+            </a:graphic>
+          </wp:inline>
+        </w:drawing>
+      </w:r>
+    </w:p>
+    <w:p>
+      <w:pPr>
+        <w:spacing w:after="0" w:line="240" w:lineRule="auto"/>
+        <w:jc w:val="both"/>
+        <w:rPr>
+          <w:rFonts w:ascii="Times New Roman" w:hAnsi="Times New Roman" w:cs="Times New Roman"/>
+        </w:rPr>
+      </w:pPr>
+    </w:p>
+    <w:p>
+      <w:pPr>
+        <w:spacing w:after="0" w:line="240" w:lineRule="auto"/>
+        <w:jc w:val="both"/>
+        <w:rPr>
+          <w:rFonts w:ascii="Times New Roman" w:hAnsi="Times New Roman" w:cs="Times New Roman"/>
+        </w:rPr>
+      </w:pPr>
       <w:r>
         <w:rPr>
           <w:rFonts w:ascii="Times New Roman" w:hAnsi="Times New Roman" w:cs="Times New Roman"/>
@@ -11665,7 +12124,6 @@
         <w:rPr>
           <w:rFonts w:ascii="Times New Roman" w:hAnsi="Times New Roman" w:cs="Times New Roman"/>
         </w:rPr>
-        <w:lastRenderedPageBreak/>
         <w:t>○</w:t>
       </w:r>
       <w:r>
@@ -11798,7 +12256,7 @@
                     <pic:cNvPicPr/>
                   </pic:nvPicPr>
                   <pic:blipFill>
-                    <a:blip r:embed="rId28"/>
+                    <a:blip r:embed="rId31"/>
                     <a:stretch>
                       <a:fillRect/>
                     </a:stretch>
@@ -11847,6 +12305,7 @@
         <w:rPr>
           <w:rFonts w:ascii="Times New Roman" w:hAnsi="Times New Roman" w:cs="Times New Roman"/>
         </w:rPr>
+        <w:lastRenderedPageBreak/>
         <w:t xml:space="preserve">Minden telephely kapott privát és publikus IP címeket, amivel tudnak kommunikálni a saját hálózatukon belül, illetve elérik a szolgáltatót, vagyis az internetet. </w:t>
       </w:r>
     </w:p>
@@ -11979,7 +12438,7 @@
                     <pic:cNvPicPr/>
                   </pic:nvPicPr>
                   <pic:blipFill>
-                    <a:blip r:embed="rId29"/>
+                    <a:blip r:embed="rId32"/>
                     <a:stretch>
                       <a:fillRect/>
                     </a:stretch>
@@ -12012,7 +12471,6 @@
         <w:rPr>
           <w:rFonts w:ascii="Times New Roman" w:hAnsi="Times New Roman" w:cs="Times New Roman"/>
         </w:rPr>
-        <w:lastRenderedPageBreak/>
         <w:t xml:space="preserve">IP címzés </w:t>
       </w:r>
       <w:r>
@@ -12535,6 +12993,7 @@
           <w:rFonts w:ascii="Times New Roman" w:hAnsi="Times New Roman" w:cs="Times New Roman"/>
           <w:noProof/>
         </w:rPr>
+        <w:lastRenderedPageBreak/>
         <w:drawing>
           <wp:inline distT="0" distB="0" distL="0" distR="0" wp14:anchorId="2B7E285D" wp14:editId="71BC7E39">
             <wp:extent cx="5760720" cy="2067560"/>
@@ -12551,7 +13010,7 @@
                     <pic:cNvPicPr/>
                   </pic:nvPicPr>
                   <pic:blipFill>
-                    <a:blip r:embed="rId30"/>
+                    <a:blip r:embed="rId33"/>
                     <a:stretch>
                       <a:fillRect/>
                     </a:stretch>
@@ -12788,7 +13247,6 @@
           <w:b/>
           <w:bCs/>
         </w:rPr>
-        <w:lastRenderedPageBreak/>
         <w:t>Telekom-specifikus példa:</w:t>
       </w:r>
     </w:p>
@@ -13125,6 +13583,7 @@
           <w:b/>
           <w:bCs/>
         </w:rPr>
+        <w:lastRenderedPageBreak/>
         <w:t>Központi menedzsment</w:t>
       </w:r>
       <w:r>
@@ -13256,7 +13715,7 @@
                     <pic:cNvPicPr/>
                   </pic:nvPicPr>
                   <pic:blipFill>
-                    <a:blip r:embed="rId31"/>
+                    <a:blip r:embed="rId34"/>
                     <a:stretch>
                       <a:fillRect/>
                     </a:stretch>
@@ -13338,7 +13797,6 @@
           <w:b/>
           <w:bCs/>
         </w:rPr>
-        <w:lastRenderedPageBreak/>
         <w:t>Miért fontos?</w:t>
       </w:r>
     </w:p>
@@ -13574,6 +14032,7 @@
           <w:rFonts w:ascii="Times New Roman" w:hAnsi="Times New Roman" w:cs="Times New Roman"/>
           <w:noProof/>
         </w:rPr>
+        <w:lastRenderedPageBreak/>
         <w:drawing>
           <wp:inline distT="0" distB="0" distL="0" distR="0" wp14:anchorId="4840A9CC" wp14:editId="02691F4A">
             <wp:extent cx="1581150" cy="1438275"/>
@@ -13590,7 +14049,7 @@
                     <pic:cNvPicPr/>
                   </pic:nvPicPr>
                   <pic:blipFill>
-                    <a:blip r:embed="rId32"/>
+                    <a:blip r:embed="rId35"/>
                     <a:stretch>
                       <a:fillRect/>
                     </a:stretch>
@@ -13631,7 +14090,7 @@
                     <pic:cNvPicPr/>
                   </pic:nvPicPr>
                   <pic:blipFill>
-                    <a:blip r:embed="rId33"/>
+                    <a:blip r:embed="rId36"/>
                     <a:stretch>
                       <a:fillRect/>
                     </a:stretch>
@@ -14096,7 +14555,6 @@
               <w:rPr>
                 <w:rFonts w:ascii="Times New Roman" w:hAnsi="Times New Roman" w:cs="Times New Roman"/>
               </w:rPr>
-              <w:lastRenderedPageBreak/>
               <w:t>Távmunka – SOHO</w:t>
             </w:r>
           </w:p>
@@ -14670,6 +15128,7 @@
         <w:rPr>
           <w:rFonts w:ascii="Times New Roman" w:hAnsi="Times New Roman" w:cs="Times New Roman"/>
         </w:rPr>
+        <w:lastRenderedPageBreak/>
         <w:t xml:space="preserve">A feltüntetett IP-kel lett beállítva: </w:t>
       </w:r>
     </w:p>
@@ -14706,7 +15165,6 @@
           <w:rFonts w:ascii="Times New Roman" w:hAnsi="Times New Roman" w:cs="Times New Roman"/>
           <w:noProof/>
         </w:rPr>
-        <w:lastRenderedPageBreak/>
         <w:drawing>
           <wp:inline distT="0" distB="0" distL="0" distR="0" wp14:anchorId="64206328" wp14:editId="3F0535B6">
             <wp:extent cx="4400550" cy="7124700"/>
@@ -14723,7 +15181,7 @@
                     <pic:cNvPicPr/>
                   </pic:nvPicPr>
                   <pic:blipFill>
-                    <a:blip r:embed="rId34"/>
+                    <a:blip r:embed="rId37"/>
                     <a:stretch>
                       <a:fillRect/>
                     </a:stretch>
@@ -14802,7 +15260,7 @@
                     <pic:cNvPicPr/>
                   </pic:nvPicPr>
                   <pic:blipFill>
-                    <a:blip r:embed="rId35"/>
+                    <a:blip r:embed="rId38"/>
                     <a:stretch>
                       <a:fillRect/>
                     </a:stretch>
@@ -14899,7 +15357,7 @@
                     <pic:cNvPicPr/>
                   </pic:nvPicPr>
                   <pic:blipFill>
-                    <a:blip r:embed="rId36"/>
+                    <a:blip r:embed="rId39"/>
                     <a:stretch>
                       <a:fillRect/>
                     </a:stretch>
@@ -14949,7 +15407,7 @@
                     <pic:cNvPicPr/>
                   </pic:nvPicPr>
                   <pic:blipFill>
-                    <a:blip r:embed="rId37"/>
+                    <a:blip r:embed="rId40"/>
                     <a:stretch>
                       <a:fillRect/>
                     </a:stretch>
@@ -15023,7 +15481,7 @@
                     <pic:cNvPicPr/>
                   </pic:nvPicPr>
                   <pic:blipFill>
-                    <a:blip r:embed="rId38"/>
+                    <a:blip r:embed="rId41"/>
                     <a:stretch>
                       <a:fillRect/>
                     </a:stretch>
@@ -15097,7 +15555,7 @@
                     <pic:cNvPicPr/>
                   </pic:nvPicPr>
                   <pic:blipFill>
-                    <a:blip r:embed="rId39"/>
+                    <a:blip r:embed="rId42"/>
                     <a:stretch>
                       <a:fillRect/>
                     </a:stretch>
@@ -15147,7 +15605,7 @@
                     <pic:cNvPicPr/>
                   </pic:nvPicPr>
                   <pic:blipFill>
-                    <a:blip r:embed="rId40"/>
+                    <a:blip r:embed="rId43"/>
                     <a:stretch>
                       <a:fillRect/>
                     </a:stretch>
@@ -15533,7 +15991,7 @@
                     <pic:cNvPicPr/>
                   </pic:nvPicPr>
                   <pic:blipFill>
-                    <a:blip r:embed="rId41"/>
+                    <a:blip r:embed="rId44"/>
                     <a:stretch>
                       <a:fillRect/>
                     </a:stretch>
@@ -15582,7 +16040,7 @@
                     <pic:cNvPicPr/>
                   </pic:nvPicPr>
                   <pic:blipFill>
-                    <a:blip r:embed="rId42"/>
+                    <a:blip r:embed="rId45"/>
                     <a:stretch>
                       <a:fillRect/>
                     </a:stretch>
@@ -15751,7 +16209,7 @@
                     <pic:cNvPicPr/>
                   </pic:nvPicPr>
                   <pic:blipFill>
-                    <a:blip r:embed="rId43"/>
+                    <a:blip r:embed="rId46"/>
                     <a:stretch>
                       <a:fillRect/>
                     </a:stretch>
@@ -16753,7 +17211,7 @@
                     <pic:cNvPicPr/>
                   </pic:nvPicPr>
                   <pic:blipFill>
-                    <a:blip r:embed="rId44"/>
+                    <a:blip r:embed="rId47"/>
                     <a:stretch>
                       <a:fillRect/>
                     </a:stretch>
@@ -16803,7 +17261,7 @@
                     <pic:cNvPicPr/>
                   </pic:nvPicPr>
                   <pic:blipFill>
-                    <a:blip r:embed="rId45"/>
+                    <a:blip r:embed="rId48"/>
                     <a:stretch>
                       <a:fillRect/>
                     </a:stretch>
@@ -16852,7 +17310,7 @@
                     <pic:cNvPicPr/>
                   </pic:nvPicPr>
                   <pic:blipFill>
-                    <a:blip r:embed="rId46"/>
+                    <a:blip r:embed="rId49"/>
                     <a:stretch>
                       <a:fillRect/>
                     </a:stretch>
@@ -16901,7 +17359,7 @@
                     <pic:cNvPicPr/>
                   </pic:nvPicPr>
                   <pic:blipFill>
-                    <a:blip r:embed="rId47"/>
+                    <a:blip r:embed="rId50"/>
                     <a:stretch>
                       <a:fillRect/>
                     </a:stretch>
@@ -16951,7 +17409,7 @@
                     <pic:cNvPicPr/>
                   </pic:nvPicPr>
                   <pic:blipFill>
-                    <a:blip r:embed="rId48"/>
+                    <a:blip r:embed="rId51"/>
                     <a:stretch>
                       <a:fillRect/>
                     </a:stretch>
@@ -17000,7 +17458,7 @@
                     <pic:cNvPicPr/>
                   </pic:nvPicPr>
                   <pic:blipFill>
-                    <a:blip r:embed="rId49"/>
+                    <a:blip r:embed="rId52"/>
                     <a:stretch>
                       <a:fillRect/>
                     </a:stretch>
@@ -19529,7 +19987,7 @@
       </w:pPr>
     </w:p>
     <w:sectPr>
-      <w:headerReference w:type="default" r:id="rId50"/>
+      <w:headerReference w:type="default" r:id="rId53"/>
       <w:pgSz w:w="11906" w:h="16838"/>
       <w:pgMar w:top="1417" w:right="1417" w:bottom="1417" w:left="1417" w:header="708" w:footer="708" w:gutter="0"/>
       <w:cols w:space="708"/>
@@ -23355,7 +23813,6 @@
   <w:style w:type="character" w:default="1" w:styleId="Bekezdsalapbettpusa">
     <w:name w:val="Default Paragraph Font"/>
     <w:uiPriority w:val="1"/>
-    <w:semiHidden/>
     <w:unhideWhenUsed/>
   </w:style>
   <w:style w:type="table" w:default="1" w:styleId="Normltblzat">
@@ -24076,4 +24533,16 @@
     </a:ext>
   </a:extLst>
 </a:theme>
+</file>
+
+<file path=customXml/item1.xml><?xml version="1.0" encoding="utf-8"?>
+<b:Sources xmlns:b="http://schemas.openxmlformats.org/officeDocument/2006/bibliography" xmlns="http://schemas.openxmlformats.org/officeDocument/2006/bibliography" SelectedStyle="\APASixthEditionOfficeOnline.xsl" StyleName="APA" Version="6"/>
+</file>
+
+<file path=customXml/itemProps1.xml><?xml version="1.0" encoding="utf-8"?>
+<ds:datastoreItem xmlns:ds="http://schemas.openxmlformats.org/officeDocument/2006/customXml" ds:itemID="{E0CECF13-4905-4657-A6CF-03A93DD98470}">
+  <ds:schemaRefs>
+    <ds:schemaRef ds:uri="http://schemas.openxmlformats.org/officeDocument/2006/bibliography"/>
+  </ds:schemaRefs>
+</ds:datastoreItem>
 </file>
</xml_diff>